<commit_message>
Update IAB application recipient to Cristhian David Caceres Mateus (Project Coordinator)
</commit_message>
<xml_diff>
--- a/02_raw_data/applications/Antrag_SUF_EN_Jubilacion_Potsdam.docx
+++ b/02_raw_data/applications/Antrag_SUF_EN_Jubilacion_Potsdam.docx
@@ -952,9 +952,9 @@
           <w:rFonts w:ascii="Calibri" w:hAnsi="Calibri"/>
           <w:sz w:val="21"/>
         </w:rPr>
-        <w:t>Prof. Dr. Talha Ali Khan</w:t>
-        <w:br/>
-        <w:t>Vice President for Research | Professor of Data Science</w:t>
+        <w:t>Cristhian David Cáceres Mateus</w:t>
+        <w:br/>
+        <w:t>Academic Researcher / Project Coordinator</w:t>
         <w:br/>
         <w:t>Department of Business</w:t>
         <w:br/>
@@ -962,7 +962,9 @@
         <w:br/>
         <w:t>Think Campus, Konrad-Zuse-Ring 11, 14469 Potsdam, Germany</w:t>
         <w:br/>
-        <w:t>E-Mail: talhaali.khan@ue-germany.de | Phone: +49 30 338539710</w:t>
+        <w:t>E-Mail: cristhian.caceres@ue-germany.de | Phone: +49 157 58042367</w:t>
+        <w:br/>
+        <w:t>(Project Director: Prof. Dr. Talha Ali Khan)</w:t>
       </w:r>
     </w:p>
     <w:p>

</xml_diff>

<commit_message>
Fix IAB Word templates: check official template checkboxes and fill full security concept
</commit_message>
<xml_diff>
--- a/02_raw_data/applications/Antrag_SUF_EN_Jubilacion_Potsdam.docx
+++ b/02_raw_data/applications/Antrag_SUF_EN_Jubilacion_Potsdam.docx
@@ -946,11 +946,12 @@
           <w:u w:val="single"/>
           <w:lang w:val="en-GB"/>
         </w:rPr>
+        <w:jc w:val="left"/>
       </w:pPr>
       <w:r>
         <w:rPr>
           <w:rFonts w:ascii="Calibri" w:hAnsi="Calibri"/>
-          <w:sz w:val="21"/>
+          <w:sz w:val="20"/>
         </w:rPr>
         <w:t>Cristhian David Cáceres Mateus</w:t>
         <w:br/>
@@ -1313,11 +1314,12 @@
           <w:szCs w:val="22"/>
           <w:lang w:val="en-GB"/>
         </w:rPr>
+        <w:jc w:val="left"/>
       </w:pPr>
       <w:r>
         <w:rPr>
           <w:rFonts w:ascii="Calibri" w:hAnsi="Calibri"/>
-          <w:sz w:val="21"/>
+          <w:sz w:val="20"/>
         </w:rPr>
         <w:t>Wealth, Migration &amp; Retirement Sustainability in Germany: Dynamic Microsimulation and Econometric Policy Analysis (2025–2070)</w:t>
       </w:r>
@@ -1393,38 +1395,39 @@
           <w:szCs w:val="22"/>
           <w:lang w:val="en-GB"/>
         </w:rPr>
+        <w:jc w:val="left"/>
       </w:pPr>
       <w:r>
         <w:rPr>
           <w:rFonts w:ascii="Calibri" w:hAnsi="Calibri"/>
-          <w:sz w:val="21"/>
+          <w:sz w:val="20"/>
         </w:rPr>
         <w:t>1. Problem Statement &amp; Research Objectives:</w:t>
         <w:br/>
-        <w:t>This research project investigates statutory pension accumulation (GRV, SGB VI) and long-term old-age poverty risks across diverse migration and demographic cohorts in Germany. In the context of demographic aging and shifting labor supply, understanding the pace and quality of labor market integration among immigrant populations is essential. Neuarrivals—particularly from Ukraine (§ 24 AufenthG) and humanitarian source countries—frequently possess substantial formal human capital but initially face deskilling, delayed qualification recognition, and language acquisition hurdles.</w:t>
-        <w:br/>
-        <w:br/>
-        <w:t>This project utilizes microdata from the IAB-BAMF-SOEP Survey of Refugees and the IAB-SOEP Migration Samples to:</w:t>
-        <w:br/>
-        <w:t>(a) Empirically estimate the determinants and timeline of transition into regular social-security-contributing employment (sozialversicherungspflichtige Beschäftigung) over duration of residence.</w:t>
-        <w:br/>
-        <w:t>(b) Quantify the wage penalty of unaccredited foreign qualifications (deskilling) and the premium of CEFR German language acquisition (A1 to C2).</w:t>
+        <w:t>This research project investigates statutory pension accumulation (GRV, SGB VI) and long-term old-age poverty risks across diverse migration and demographic cohorts in Germany. In the context of demographic aging and shifting labor supply, understanding the pace and quality of labor market integration among immigrant populations is essential.</w:t>
+        <w:br/>
+        <w:br/>
+        <w:t>This project utilizes longitudinal microdata from the IAB (SIAB and PASS) to:</w:t>
+        <w:br/>
+        <w:t>(a) Empirically estimate the determinants and timeline of transition into regular social-security-contributing employment (sozialversicherungspflichtige Beschäftigung) over duration of residence and employment biographies.</w:t>
+        <w:br/>
+        <w:t>(b) Quantify wage progression, interruptions, and the returns to qualification recognition and language acquisition across native and migrant workers.</w:t>
         <w:br/>
         <w:t>(c) Calibrate a dynamic life-cycle microsimulation platform (2025–2070) that projects annual pension points (Entgeltpunkte), child-rearing credits (§ 56 SGB VI), and old-age social assistance interaction (Grundsicherung im Alter, SGB XII).</w:t>
         <w:br/>
         <w:br/>
         <w:t>2. Core Hypotheses:</w:t>
         <w:br/>
-        <w:t>- Hypothesis 1 (Assimilation Trajectory): The probability of regular social-security employment increases concavely with residence duration, with formal qualification recognition accelerating wage growth.</w:t>
-        <w:br/>
-        <w:t>- Hypothesis 2 (Deskilling Wage Gap): Foreign tertiary degrees without formal German recognition yield substantial initial gross earnings penalties compared to recognized equivalents.</w:t>
-        <w:br/>
-        <w:t>- Hypothesis 3 (Language Capital): Attaining B2/C-level German proficiency significantly increases monthly gross earnings and annual pension point accumulation.</w:t>
+        <w:t>- Hypothesis 1 (Assimilation Trajectory): The probability of regular social-security employment increases concavely with residence duration and employment tenure.</w:t>
+        <w:br/>
+        <w:t>- Hypothesis 2 (Earnings &amp; Contribution Gap): Immigrant and refugee cohorts face initial wage and contribution gaps that narrow over multi-decade horizons.</w:t>
+        <w:br/>
+        <w:t>- Hypothesis 3 (Social Safety Net Buffer): Low-earning biographies accumulate lower statutory pension rights, heightening reliance on basic security in old age (SGB XII).</w:t>
         <w:br/>
         <w:br/>
         <w:t>3. Methodology:</w:t>
         <w:br/>
-        <w:t>- Econometric Estimation: Extended Mincerian earnings equations and longitudinal panel regressions (Fixed and Random Effects) modeling log gross wages and Entgeltpunkte accumulation with robust standard errors.</w:t>
+        <w:t>- Econometric Estimation: Extended Mincerian earnings equations and longitudinal panel regressions modeling gross wages and contribution spells with robust standard errors.</w:t>
         <w:br/>
         <w:t>- Dynamic Microsimulation: Synthesizing estimated empirical distributions into forward-looking individual lifecycle paths up to the statutory retirement age of 67.</w:t>
       </w:r>
@@ -1526,17 +1529,18 @@
           <w:szCs w:val="22"/>
           <w:lang w:val="en-GB"/>
         </w:rPr>
+        <w:jc w:val="left"/>
       </w:pPr>
       <w:r>
         <w:rPr>
           <w:rFonts w:ascii="Calibri" w:hAnsi="Calibri"/>
-          <w:sz w:val="21"/>
+          <w:sz w:val="20"/>
         </w:rPr>
         <w:t>The project directly addresses central questions of scientific labour market research by analyzing:</w:t>
         <w:br/>
-        <w:t>1. Transition rates and pathways of migrants and refugees into regular, insured employment vs. marginal employment (Minijobs) or unemployment.</w:t>
-        <w:br/>
-        <w:t>2. The returns to human capital, qualification recognition procedures, and host-country language acquisition in the German labor market.</w:t>
+        <w:t>1. Transition rates and pathways of workers into regular, insured employment vs. marginal employment (Minijobs) or unemployment over time.</w:t>
+        <w:br/>
+        <w:t>2. The returns to human capital and employment stability in the German labor market across nationalities.</w:t>
         <w:br/>
         <w:t>3. The long-term transmission of labor market integration outcomes into statutory pension entitlements and social insurance sustainability.</w:t>
       </w:r>
@@ -1556,11 +1560,12 @@
           <w:szCs w:val="22"/>
           <w:lang w:val="en-GB"/>
         </w:rPr>
+        <w:jc w:val="left"/>
       </w:pPr>
       <w:r>
         <w:rPr>
           <w:rFonts w:ascii="Calibri" w:hAnsi="Calibri"/>
-          <w:sz w:val="21"/>
+          <w:sz w:val="20"/>
         </w:rPr>
         <w:t>12/31/2027</w:t>
       </w:r>
@@ -1621,11 +1626,12 @@
           <w:szCs w:val="22"/>
           <w:lang w:val="en-GB"/>
         </w:rPr>
+        <w:jc w:val="left"/>
       </w:pPr>
       <w:r>
         <w:rPr>
           <w:rFonts w:ascii="Calibri" w:hAnsi="Calibri"/>
-          <w:sz w:val="21"/>
+          <w:sz w:val="20"/>
         </w:rPr>
         <w:t>No. Internal academic research project conducted at the University of Europe for Applied Sciences under faculty supervision (no third-party commercial funding).</w:t>
       </w:r>
@@ -1974,8 +1980,8 @@
                   <w:calcOnExit w:val="0"/>
                   <w:checkBox>
                     <w:sizeAuto/>
-                    <w:default w:val="0"/>
-                    <w:checked w:val="0"/>
+                    <w:default w:val="1"/>
+                    <w:checked w:val="1"/>
                   </w:checkBox>
                 </w:ffData>
               </w:fldChar>
@@ -2106,7 +2112,8 @@
                   <w:calcOnExit w:val="0"/>
                   <w:checkBox>
                     <w:sizeAuto/>
-                    <w:default w:val="0"/>
+                    <w:default w:val="1"/>
+                    <w:checked w:val="1"/>
                   </w:checkBox>
                 </w:ffData>
               </w:fldChar>
@@ -2309,28 +2316,6 @@
           </w:p>
         </w:tc>
       </w:tr>
-      <w:tr>
-        <w:tc>
-          <w:tcPr>
-            <w:tcW w:type="dxa" w:w="4644"/>
-          </w:tcPr>
-          <w:p>
-            <w:r>
-              <w:t>[X] IAB-BAMF-SOEP Survey of Refugees (Samples M3–M5, Scientific Use File)</w:t>
-            </w:r>
-          </w:p>
-        </w:tc>
-        <w:tc>
-          <w:tcPr>
-            <w:tcW w:type="dxa" w:w="4558"/>
-          </w:tcPr>
-          <w:p>
-            <w:r>
-              <w:t>[X] IAB-SOEP Migration Samples (Samples M1–M2, Scientific Use File)</w:t>
-            </w:r>
-          </w:p>
-        </w:tc>
-      </w:tr>
     </w:tbl>
     <w:bookmarkEnd w:id="4"/>
     <w:p>
@@ -2421,27 +2406,22 @@
           <w:szCs w:val="22"/>
           <w:lang w:val="en-GB"/>
         </w:rPr>
+        <w:jc w:val="left"/>
       </w:pPr>
       <w:r>
         <w:rPr>
           <w:rFonts w:ascii="Calibri" w:hAnsi="Calibri"/>
-          <w:sz w:val="21"/>
-        </w:rPr>
-        <w:t>The requested microdata are strictly necessary because published aggregate statistics lack multivariate cross-tabulations of residence duration, foreign credential recognition status, German language proficiency, and monthly gross wages.</w:t>
-        <w:br/>
-        <w:br/>
-        <w:t>Only the IAB-BAMF-SOEP Survey of Refugees and IAB-SOEP Migration Samples provide:</w:t>
-        <w:br/>
-        <w:t>1. Detailed arrival cohorts, legal residency status, and migration biographies.</w:t>
-        <w:br/>
-        <w:t>2. Verified accreditation procedures for foreign educational and vocational qualifications.</w:t>
-        <w:br/>
-        <w:t>3. Standardized language competence indicators according to the CEFR (A1–C2).</w:t>
-        <w:br/>
-        <w:t>4. Granular monthly gross and net employment earnings necessary to model pension contribution trajectories.</w:t>
-        <w:br/>
-        <w:br/>
-        <w:t>Aggregated data cannot identify the multivariate returns to qualification recognition and language acquisition required to calibrate our microsimulation models.</w:t>
+          <w:sz w:val="20"/>
+        </w:rPr>
+        <w:t>The requested microdata are strictly necessary because published aggregate statistics lack longitudinal tracking of individual employment spells, daily gross wages, and benefit receipt durations.</w:t>
+        <w:br/>
+        <w:br/>
+        <w:t>- The SIAB (Sample of Integrated Labour Market Biographies) provides the precise longitudinal daily employment and contribution histories from 1975 to 2023 required to model wage growth and pension point accumulation.</w:t>
+        <w:br/>
+        <w:t>- The PASS (Panel Study Labour Market and Social Security) provides detailed household-level information on low-income dynamics, benefit receipt (SGB II), and migrant background integration.</w:t>
+        <w:br/>
+        <w:br/>
+        <w:t>Together, these files provide the authoritative empirical moments needed to calibrate our dynamic microsimulation models beyond stylized assumptions.</w:t>
       </w:r>
     </w:p>
     <w:p>
@@ -2557,11 +2537,12 @@
           <w:szCs w:val="22"/>
           <w:lang w:val="en-GB"/>
         </w:rPr>
+        <w:jc w:val="left"/>
       </w:pPr>
       <w:r>
         <w:rPr>
           <w:rFonts w:ascii="Calibri" w:hAnsi="Calibri"/>
-          <w:sz w:val="21"/>
+          <w:sz w:val="20"/>
         </w:rPr>
         <w:t>University of Europe for Applied Sciences GmbH</w:t>
         <w:br/>
@@ -2658,11 +2639,12 @@
           <w:szCs w:val="22"/>
           <w:lang w:val="en-GB"/>
         </w:rPr>
+        <w:jc w:val="left"/>
       </w:pPr>
       <w:r>
         <w:rPr>
           <w:rFonts w:ascii="Calibri" w:hAnsi="Calibri"/>
-          <w:sz w:val="21"/>
+          <w:sz w:val="20"/>
         </w:rPr>
         <w:t>University of Europe for Applied Sciences, Potsdam Campus</w:t>
         <w:br/>
@@ -2879,11 +2861,12 @@
           <w:szCs w:val="22"/>
           <w:lang w:val="en-GB"/>
         </w:rPr>
+        <w:jc w:val="left"/>
       </w:pPr>
       <w:r>
         <w:rPr>
           <w:rFonts w:ascii="Calibri" w:hAnsi="Calibri"/>
-          <w:sz w:val="21"/>
+          <w:sz w:val="20"/>
         </w:rPr>
         <w:t>State-accredited German higher education institution (University of Europe for Applied Sciences) with full institutional accreditation for independent scientific research and higher education under German federal and state law.</w:t>
       </w:r>
@@ -2964,11 +2947,12 @@
           <w:szCs w:val="22"/>
           <w:lang w:val="en-GB"/>
         </w:rPr>
+        <w:jc w:val="left"/>
       </w:pPr>
       <w:r>
         <w:rPr>
           <w:rFonts w:ascii="Calibri" w:hAnsi="Calibri"/>
-          <w:sz w:val="21"/>
+          <w:sz w:val="20"/>
         </w:rPr>
         <w:t>None (internal university project).</w:t>
       </w:r>
@@ -3145,11 +3129,12 @@
           <w:szCs w:val="22"/>
           <w:lang w:val="en-GB"/>
         </w:rPr>
+        <w:jc w:val="left"/>
       </w:pPr>
       <w:r>
         <w:rPr>
           <w:rFonts w:ascii="Calibri" w:hAnsi="Calibri"/>
-          <w:sz w:val="21"/>
+          <w:sz w:val="20"/>
         </w:rPr>
         <w:t>User 1 (Academic Project Director / Supervising Faculty):</w:t>
         <w:br/>
@@ -3164,7 +3149,7 @@
         <w:t>Phone: +49 30 338539710 | E-Mail: talhaali.khan@ue-germany.de</w:t>
         <w:br/>
         <w:br/>
-        <w:t>User 2 (Academic Researcher / Project Member):</w:t>
+        <w:t>User 2 (Academic Researcher / Project Coordinator):</w:t>
         <w:br/>
         <w:t>Cristhian David Cáceres Mateus (Student ID: 93515346)</w:t>
         <w:br/>

</xml_diff>